<commit_message>
Scrub PII that Word and PowerPoint split across text runs
Detection and replacement now read a DOCX/PPTX paragraph as one string and
write the fake back through the original runs, so names, emails and account
numbers broken up by formatting or spell-check can no longer survive as
fragments. Tracked deletions are scrubbed too, and the fixture corpus now
includes split-run cases.

🤖 Generated with Codebuff
Co-Authored-By: Codebuff <noreply@codebuff.com>
</commit_message>
<xml_diff>
--- a/fixtures/kyc-profile.docx
+++ b/fixtures/kyc-profile.docx
@@ -9,7 +9,10 @@
     </w:p>
     <w:p>
       <w:r>
-        <w:t xml:space="preserve">Full name: Marcus Webb</w:t>
+        <w:t xml:space="preserve">Full name: Marcus </w:t>
+      </w:r>
+      <w:r>
+        <w:t xml:space="preserve">Webb</w:t>
       </w:r>
     </w:p>
     <w:p>
@@ -34,7 +37,10 @@
     </w:p>
     <w:p>
       <w:r>
-        <w:t xml:space="preserve">Email: marcus.webb@example.com</w:t>
+        <w:t xml:space="preserve">Email: marcus.webb@</w:t>
+      </w:r>
+      <w:r>
+        <w:t xml:space="preserve">example.com</w:t>
       </w:r>
     </w:p>
     <w:p>
@@ -79,7 +85,10 @@
     </w:p>
     <w:p>
       <w:r>
-        <w:t xml:space="preserve">Spouse: Jane Doe</w:t>
+        <w:t xml:space="preserve">Spouse: Jane </w:t>
+      </w:r>
+      <w:r>
+        <w:t xml:space="preserve">Doe</w:t>
       </w:r>
     </w:p>
     <w:p>
@@ -132,14 +141,20 @@
         <w:tc>
           <w:p>
             <w:r>
-              <w:t xml:space="preserve">Jane Doe</w:t>
-            </w:r>
-          </w:p>
-        </w:tc>
-        <w:tc>
-          <w:p>
-            <w:r>
-              <w:t xml:space="preserve">jane.doe@example.com</w:t>
+              <w:t xml:space="preserve">Jane</w:t>
+            </w:r>
+            <w:r>
+              <w:t xml:space="preserve"> Doe</w:t>
+            </w:r>
+          </w:p>
+        </w:tc>
+        <w:tc>
+          <w:p>
+            <w:r>
+              <w:t xml:space="preserve">jane.doe@</w:t>
+            </w:r>
+            <w:r>
+              <w:t xml:space="preserve">example.com</w:t>
             </w:r>
           </w:p>
         </w:tc>

</xml_diff>